<commit_message>
All templates/code changed other than I-765
</commit_message>
<xml_diff>
--- a/docassemble/ImmigrationWorkAuthorization/data/templates/COV_motion.docx
+++ b/docassemble/ImmigrationWorkAuthorization/data/templates/COV_motion.docx
@@ -1,6 +1,6 @@
 
 <file path=word/document.xml><?xml version="1.0" encoding="utf-8"?>
-<w:document xmlns:wpc="http://schemas.microsoft.com/office/word/2010/wordprocessingCanvas" xmlns:cx="http://schemas.microsoft.com/office/drawing/2014/chartex" xmlns:cx1="http://schemas.microsoft.com/office/drawing/2015/9/8/chartex" xmlns:cx2="http://schemas.microsoft.com/office/drawing/2015/10/21/chartex" xmlns:cx3="http://schemas.microsoft.com/office/drawing/2016/5/9/chartex" xmlns:cx4="http://schemas.microsoft.com/office/drawing/2016/5/10/chartex" xmlns:cx5="http://schemas.microsoft.com/office/drawing/2016/5/11/chartex" xmlns:cx6="http://schemas.microsoft.com/office/drawing/2016/5/12/chartex" xmlns:cx7="http://schemas.microsoft.com/office/drawing/2016/5/13/chartex" xmlns:cx8="http://schemas.microsoft.com/office/drawing/2016/5/14/chartex" xmlns:mc="http://schemas.openxmlformats.org/markup-compatibility/2006" xmlns:aink="http://schemas.microsoft.com/office/drawing/2016/ink" xmlns:am3d="http://schemas.microsoft.com/office/drawing/2017/model3d" xmlns:o="urn:schemas-microsoft-com:office:office" xmlns:oel="http://schemas.microsoft.com/office/2019/extlst" xmlns:r="http://schemas.openxmlformats.org/officeDocument/2006/relationships" xmlns:m="http://schemas.openxmlformats.org/officeDocument/2006/math" xmlns:v="urn:schemas-microsoft-com:vml" xmlns:wp14="http://schemas.microsoft.com/office/word/2010/wordprocessingDrawing" xmlns:wp="http://schemas.openxmlformats.org/drawingml/2006/wordprocessingDrawing" xmlns:w10="urn:schemas-microsoft-com:office:word" xmlns:w="http://schemas.openxmlformats.org/wordprocessingml/2006/main" xmlns:w14="http://schemas.microsoft.com/office/word/2010/wordml" xmlns:w15="http://schemas.microsoft.com/office/word/2012/wordml" xmlns:w16cex="http://schemas.microsoft.com/office/word/2018/wordml/cex" xmlns:w16cid="http://schemas.microsoft.com/office/word/2016/wordml/cid" xmlns:w16="http://schemas.microsoft.com/office/word/2018/wordml" xmlns:w16sdtdh="http://schemas.microsoft.com/office/word/2020/wordml/sdtdatahash" xmlns:w16se="http://schemas.microsoft.com/office/word/2015/wordml/symex" xmlns:wpg="http://schemas.microsoft.com/office/word/2010/wordprocessingGroup" xmlns:wpi="http://schemas.microsoft.com/office/word/2010/wordprocessingInk" xmlns:wne="http://schemas.microsoft.com/office/word/2006/wordml" xmlns:wps="http://schemas.microsoft.com/office/word/2010/wordprocessingShape" mc:Ignorable="w14 w15 w16se w16cid w16 w16cex w16sdtdh wp14">
+<w:document xmlns:wpc="http://schemas.microsoft.com/office/word/2010/wordprocessingCanvas" xmlns:cx="http://schemas.microsoft.com/office/drawing/2014/chartex" xmlns:cx1="http://schemas.microsoft.com/office/drawing/2015/9/8/chartex" xmlns:cx2="http://schemas.microsoft.com/office/drawing/2015/10/21/chartex" xmlns:cx3="http://schemas.microsoft.com/office/drawing/2016/5/9/chartex" xmlns:cx4="http://schemas.microsoft.com/office/drawing/2016/5/10/chartex" xmlns:cx5="http://schemas.microsoft.com/office/drawing/2016/5/11/chartex" xmlns:cx6="http://schemas.microsoft.com/office/drawing/2016/5/12/chartex" xmlns:cx7="http://schemas.microsoft.com/office/drawing/2016/5/13/chartex" xmlns:cx8="http://schemas.microsoft.com/office/drawing/2016/5/14/chartex" xmlns:mc="http://schemas.openxmlformats.org/markup-compatibility/2006" xmlns:aink="http://schemas.microsoft.com/office/drawing/2016/ink" xmlns:am3d="http://schemas.microsoft.com/office/drawing/2017/model3d" xmlns:o="urn:schemas-microsoft-com:office:office" xmlns:oel="http://schemas.microsoft.com/office/2019/extlst" xmlns:r="http://schemas.openxmlformats.org/officeDocument/2006/relationships" xmlns:m="http://schemas.openxmlformats.org/officeDocument/2006/math" xmlns:v="urn:schemas-microsoft-com:vml" xmlns:wp14="http://schemas.microsoft.com/office/word/2010/wordprocessingDrawing" xmlns:wp="http://schemas.openxmlformats.org/drawingml/2006/wordprocessingDrawing" xmlns:w10="urn:schemas-microsoft-com:office:word" xmlns:w="http://schemas.openxmlformats.org/wordprocessingml/2006/main" xmlns:w14="http://schemas.microsoft.com/office/word/2010/wordml" xmlns:w15="http://schemas.microsoft.com/office/word/2012/wordml" xmlns:w16cex="http://schemas.microsoft.com/office/word/2018/wordml/cex" xmlns:w16cid="http://schemas.microsoft.com/office/word/2016/wordml/cid" xmlns:w16="http://schemas.microsoft.com/office/word/2018/wordml" xmlns:w16du="http://schemas.microsoft.com/office/word/2023/wordml/word16du" xmlns:w16sdtdh="http://schemas.microsoft.com/office/word/2020/wordml/sdtdatahash" xmlns:w16sdtfl="http://schemas.microsoft.com/office/word/2024/wordml/sdtformatlock" xmlns:w16se="http://schemas.microsoft.com/office/word/2015/wordml/symex" xmlns:wpg="http://schemas.microsoft.com/office/word/2010/wordprocessingGroup" xmlns:wpi="http://schemas.microsoft.com/office/word/2010/wordprocessingInk" xmlns:wne="http://schemas.microsoft.com/office/word/2006/wordml" xmlns:wps="http://schemas.microsoft.com/office/word/2010/wordprocessingShape" mc:Ignorable="w14 w15 w16se w16cid w16 w16cex w16sdtdh w16sdtfl w16du wp14">
   <w:body>
     <w:p>
       <w:pPr>
@@ -287,6 +287,7 @@
         </w:rPr>
         <w:t>_</w:t>
       </w:r>
+      <w:proofErr w:type="gramStart"/>
       <w:r>
         <w:rPr>
           <w:bCs/>
@@ -304,11 +305,19 @@
         <w:rPr>
           <w:bCs/>
         </w:rPr>
-        <w:t>) }}</w:t>
+        <w:t>) }</w:t>
+      </w:r>
+      <w:proofErr w:type="gramEnd"/>
+      <w:r>
+        <w:rPr>
+          <w:bCs/>
+        </w:rPr>
+        <w:t>}</w:t>
       </w:r>
       <w:r>
         <w:t xml:space="preserve"> </w:t>
       </w:r>
+      <w:proofErr w:type="gramStart"/>
       <w:r>
         <w:tab/>
         <w:t xml:space="preserve"> </w:t>
@@ -316,6 +325,7 @@
       <w:r>
         <w:t>)</w:t>
       </w:r>
+      <w:proofErr w:type="gramEnd"/>
       <w:r>
         <w:rPr>
           <w:bCs/>
@@ -333,7 +343,14 @@
         <w:rPr>
           <w:bCs/>
         </w:rPr>
-        <w:t xml:space="preserve">A# {{ </w:t>
+        <w:t xml:space="preserve">A# </w:t>
+      </w:r>
+      <w:proofErr w:type="gramStart"/>
+      <w:r>
+        <w:rPr>
+          <w:bCs/>
+        </w:rPr>
+        <w:t xml:space="preserve">{{ </w:t>
       </w:r>
       <w:r>
         <w:rPr>
@@ -341,6 +358,7 @@
         </w:rPr>
         <w:t>users</w:t>
       </w:r>
+      <w:proofErr w:type="gramEnd"/>
       <w:r>
         <w:rPr>
           <w:bCs/>
@@ -355,6 +373,7 @@
         <w:t>i</w:t>
       </w:r>
       <w:proofErr w:type="spellEnd"/>
+      <w:proofErr w:type="gramStart"/>
       <w:r>
         <w:rPr>
           <w:bCs/>
@@ -372,14 +391,35 @@
         <w:rPr>
           <w:bCs/>
         </w:rPr>
-        <w:t>a_number</w:t>
-      </w:r>
-      <w:proofErr w:type="spellEnd"/>
-      <w:r>
-        <w:rPr>
-          <w:bCs/>
-        </w:rPr>
-        <w:t xml:space="preserve"> }}</w:t>
+        <w:t>a</w:t>
+      </w:r>
+      <w:proofErr w:type="gramEnd"/>
+      <w:r>
+        <w:rPr>
+          <w:bCs/>
+        </w:rPr>
+        <w:t>_</w:t>
+      </w:r>
+      <w:proofErr w:type="gramStart"/>
+      <w:r>
+        <w:rPr>
+          <w:bCs/>
+        </w:rPr>
+        <w:t>number</w:t>
+      </w:r>
+      <w:proofErr w:type="spellEnd"/>
+      <w:r>
+        <w:rPr>
+          <w:bCs/>
+        </w:rPr>
+        <w:t xml:space="preserve"> }</w:t>
+      </w:r>
+      <w:proofErr w:type="gramEnd"/>
+      <w:r>
+        <w:rPr>
+          <w:bCs/>
+        </w:rPr>
+        <w:t>}</w:t>
       </w:r>
     </w:p>
     <w:p>
@@ -513,12 +553,17 @@
         <w:t>i</w:t>
       </w:r>
       <w:proofErr w:type="spellEnd"/>
+      <w:proofErr w:type="gramStart"/>
       <w:r>
         <w:t>].</w:t>
       </w:r>
       <w:proofErr w:type="spellStart"/>
       <w:r>
-        <w:t>immigration_judge</w:t>
+        <w:t>immigration</w:t>
+      </w:r>
+      <w:proofErr w:type="gramEnd"/>
+      <w:r>
+        <w:t>_judge</w:t>
       </w:r>
       <w:proofErr w:type="spellEnd"/>
       <w:r>
@@ -557,7 +602,6 @@
         </w:rPr>
         <w:t>(</w:t>
       </w:r>
-      <w:proofErr w:type="gramEnd"/>
       <w:r>
         <w:rPr>
           <w:bCs/>
@@ -570,6 +614,7 @@
       <w:r>
         <w:t>}</w:t>
       </w:r>
+      <w:proofErr w:type="gramEnd"/>
       <w:r>
         <w:t>}</w:t>
       </w:r>
@@ -579,6 +624,7 @@
       <w:r>
         <w:tab/>
       </w:r>
+      <w:proofErr w:type="gramStart"/>
       <w:r>
         <w:t>{</w:t>
       </w:r>
@@ -586,24 +632,38 @@
         <w:t xml:space="preserve">{ </w:t>
       </w:r>
       <w:r>
-        <w:t>users[</w:t>
+        <w:t>users</w:t>
+      </w:r>
+      <w:proofErr w:type="gramEnd"/>
+      <w:r>
+        <w:t>[</w:t>
       </w:r>
       <w:proofErr w:type="spellStart"/>
       <w:r>
         <w:t>i</w:t>
       </w:r>
       <w:proofErr w:type="spellEnd"/>
+      <w:proofErr w:type="gramStart"/>
       <w:r>
         <w:t>].</w:t>
       </w:r>
       <w:proofErr w:type="spellStart"/>
       <w:r>
-        <w:t>hearing_datetime</w:t>
+        <w:t>hearing</w:t>
+      </w:r>
+      <w:proofErr w:type="gramEnd"/>
+      <w:r>
+        <w:t>_</w:t>
+      </w:r>
+      <w:proofErr w:type="gramStart"/>
+      <w:r>
+        <w:t>datetime</w:t>
       </w:r>
       <w:r>
         <w:t>.format</w:t>
       </w:r>
       <w:proofErr w:type="spellEnd"/>
+      <w:proofErr w:type="gramEnd"/>
       <w:r>
         <w:t>(“MM/dd/</w:t>
       </w:r>
@@ -613,7 +673,11 @@
       </w:r>
       <w:proofErr w:type="spellEnd"/>
       <w:r>
-        <w:t>”)</w:t>
+        <w:t>”</w:t>
+      </w:r>
+      <w:proofErr w:type="gramStart"/>
+      <w:r>
+        <w:t>)</w:t>
       </w:r>
       <w:r>
         <w:t xml:space="preserve"> </w:t>
@@ -621,6 +685,7 @@
       <w:r>
         <w:t>}</w:t>
       </w:r>
+      <w:proofErr w:type="gramEnd"/>
       <w:r>
         <w:t>}</w:t>
       </w:r>
@@ -1068,7 +1133,13 @@
         <w:rPr>
           <w:bCs/>
         </w:rPr>
-        <w:t>address.</w:t>
+        <w:t>address</w:t>
+      </w:r>
+      <w:r>
+        <w:rPr>
+          <w:bCs/>
+        </w:rPr>
+        <w:t>.</w:t>
       </w:r>
       <w:r>
         <w:rPr>
@@ -1132,7 +1203,13 @@
         <w:rPr>
           <w:bCs/>
         </w:rPr>
-        <w:t>address.</w:t>
+        <w:t>address</w:t>
+      </w:r>
+      <w:r>
+        <w:rPr>
+          <w:bCs/>
+        </w:rPr>
+        <w:t>.</w:t>
       </w:r>
       <w:r>
         <w:rPr>
@@ -1148,7 +1225,69 @@
         <w:t xml:space="preserve"> }}</w:t>
       </w:r>
       <w:r>
-        <w:t xml:space="preserve">{% endif %} to the immigration court in Chicago, IL. </w:t>
+        <w:t xml:space="preserve">{% endif %} to the immigration court in </w:t>
+      </w:r>
+      <w:r>
+        <w:t>{{</w:t>
+      </w:r>
+      <w:r>
+        <w:t>users[</w:t>
+      </w:r>
+      <w:proofErr w:type="spellStart"/>
+      <w:r>
+        <w:t>i</w:t>
+      </w:r>
+      <w:proofErr w:type="spellEnd"/>
+      <w:r>
+        <w:t>].</w:t>
+      </w:r>
+      <w:proofErr w:type="spellStart"/>
+      <w:r>
+        <w:t>dhs.</w:t>
+      </w:r>
+      <w:r>
+        <w:t>address</w:t>
+      </w:r>
+      <w:r>
+        <w:t>.city</w:t>
+      </w:r>
+      <w:proofErr w:type="spellEnd"/>
+      <w:r>
+        <w:t>}}</w:t>
+      </w:r>
+      <w:r>
+        <w:t xml:space="preserve">, </w:t>
+      </w:r>
+      <w:r>
+        <w:t>{{</w:t>
+      </w:r>
+      <w:r>
+        <w:t>users[</w:t>
+      </w:r>
+      <w:proofErr w:type="spellStart"/>
+      <w:r>
+        <w:t>i</w:t>
+      </w:r>
+      <w:proofErr w:type="spellEnd"/>
+      <w:r>
+        <w:t>].</w:t>
+      </w:r>
+      <w:proofErr w:type="spellStart"/>
+      <w:r>
+        <w:t>dhs.</w:t>
+      </w:r>
+      <w:r>
+        <w:t>address</w:t>
+      </w:r>
+      <w:r>
+        <w:t>.state</w:t>
+      </w:r>
+      <w:proofErr w:type="spellEnd"/>
+      <w:r>
+        <w:t>}}</w:t>
+      </w:r>
+      <w:r>
+        <w:t xml:space="preserve">. </w:t>
       </w:r>
       <w:r>
         <w:t>Respondent seeks this change of venue pursuant to 8 CFR § 1003.20.</w:t>
@@ -1202,6 +1341,7 @@
         <w:t>i</w:t>
       </w:r>
       <w:proofErr w:type="spellEnd"/>
+      <w:proofErr w:type="gramStart"/>
       <w:r>
         <w:rPr>
           <w:bCs/>
@@ -1213,27 +1353,150 @@
         <w:rPr>
           <w:bCs/>
         </w:rPr>
-        <w:t>address.on_one_line</w:t>
-      </w:r>
-      <w:proofErr w:type="spellEnd"/>
-      <w:r>
-        <w:rPr>
-          <w:bCs/>
-        </w:rPr>
-        <w:t xml:space="preserve">(bare=True) </w:t>
-      </w:r>
-      <w:r>
-        <w:rPr>
-          <w:bCs/>
-        </w:rPr>
+        <w:t>address</w:t>
+      </w:r>
+      <w:proofErr w:type="gramEnd"/>
+      <w:r>
+        <w:rPr>
+          <w:bCs/>
+        </w:rPr>
+        <w:t>.on_one_line</w:t>
+      </w:r>
+      <w:proofErr w:type="spellEnd"/>
+      <w:r>
+        <w:rPr>
+          <w:bCs/>
+        </w:rPr>
+        <w:t>(bare=True</w:t>
+      </w:r>
+      <w:proofErr w:type="gramStart"/>
+      <w:r>
+        <w:rPr>
+          <w:bCs/>
+        </w:rPr>
+        <w:t xml:space="preserve">) </w:t>
+      </w:r>
+      <w:r>
+        <w:rPr>
+          <w:bCs/>
+        </w:rPr>
+        <w:t>}</w:t>
+      </w:r>
+      <w:proofErr w:type="gramEnd"/>
+      <w:r>
+        <w:rPr>
+          <w:bCs/>
+        </w:rPr>
+        <w:t>}</w:t>
+      </w:r>
+      <w:r>
+        <w:t xml:space="preserve">. I have been in the United States since </w:t>
+      </w:r>
+      <w:proofErr w:type="gramStart"/>
+      <w:r>
+        <w:t>{{ users</w:t>
+      </w:r>
+      <w:proofErr w:type="gramEnd"/>
+      <w:r>
+        <w:t>[</w:t>
+      </w:r>
+      <w:proofErr w:type="spellStart"/>
+      <w:r>
+        <w:t>i</w:t>
+      </w:r>
+      <w:proofErr w:type="spellEnd"/>
+      <w:proofErr w:type="gramStart"/>
+      <w:r>
+        <w:t>].</w:t>
+      </w:r>
+      <w:proofErr w:type="spellStart"/>
+      <w:r>
+        <w:t>date</w:t>
+      </w:r>
+      <w:proofErr w:type="gramEnd"/>
+      <w:r>
+        <w:t>_started_us_</w:t>
+      </w:r>
+      <w:proofErr w:type="gramStart"/>
+      <w:r>
+        <w:t>residence.format</w:t>
+      </w:r>
+      <w:proofErr w:type="spellEnd"/>
+      <w:proofErr w:type="gramEnd"/>
+      <w:r>
+        <w:t>("MM/dd/</w:t>
+      </w:r>
+      <w:proofErr w:type="spellStart"/>
+      <w:r>
+        <w:t>yyyy</w:t>
+      </w:r>
+      <w:proofErr w:type="spellEnd"/>
+      <w:r>
+        <w:t>"</w:t>
+      </w:r>
+      <w:proofErr w:type="gramStart"/>
+      <w:r>
+        <w:t>) }</w:t>
+      </w:r>
+      <w:proofErr w:type="gramEnd"/>
+      <w:r>
+        <w:t>}</w:t>
+      </w:r>
+      <w:r>
+        <w:t xml:space="preserve"> </w:t>
+      </w:r>
+      <w:r>
+        <w:t xml:space="preserve">and have been living in </w:t>
+      </w:r>
+      <w:proofErr w:type="gramStart"/>
+      <w:r>
+        <w:t xml:space="preserve">{{ </w:t>
+      </w:r>
+      <w:r>
+        <w:t>users</w:t>
+      </w:r>
+      <w:proofErr w:type="gramEnd"/>
+      <w:r>
+        <w:t>[</w:t>
+      </w:r>
+      <w:proofErr w:type="spellStart"/>
+      <w:r>
+        <w:t>i</w:t>
+      </w:r>
+      <w:proofErr w:type="spellEnd"/>
+      <w:proofErr w:type="gramStart"/>
+      <w:r>
+        <w:t>].</w:t>
+      </w:r>
+      <w:proofErr w:type="spellStart"/>
+      <w:r>
+        <w:t>mailing</w:t>
+      </w:r>
+      <w:proofErr w:type="gramEnd"/>
+      <w:r>
+        <w:t>_</w:t>
+      </w:r>
+      <w:proofErr w:type="gramStart"/>
+      <w:r>
+        <w:t>address.state</w:t>
+      </w:r>
+      <w:proofErr w:type="spellEnd"/>
+      <w:proofErr w:type="gramEnd"/>
+      <w:r>
+        <w:t xml:space="preserve"> </w:t>
+      </w:r>
+      <w:r>
         <w:t>}}</w:t>
       </w:r>
       <w:r>
-        <w:t xml:space="preserve">. I have been in the United States since </w:t>
-      </w:r>
-      <w:proofErr w:type="gramStart"/>
-      <w:r>
-        <w:t>{{ users</w:t>
+        <w:t xml:space="preserve"> since </w:t>
+      </w:r>
+      <w:proofErr w:type="gramStart"/>
+      <w:r>
+        <w:t xml:space="preserve">{{ </w:t>
+      </w:r>
+      <w:r>
+        <w:t>users</w:t>
       </w:r>
       <w:proofErr w:type="gramEnd"/>
       <w:r>
@@ -1244,16 +1507,29 @@
         <w:t>i</w:t>
       </w:r>
       <w:proofErr w:type="spellEnd"/>
+      <w:proofErr w:type="gramStart"/>
       <w:r>
         <w:t>].</w:t>
       </w:r>
       <w:proofErr w:type="spellStart"/>
       <w:r>
-        <w:t>date_started_us_residence.format</w:t>
-      </w:r>
-      <w:proofErr w:type="spellEnd"/>
-      <w:r>
-        <w:t>("MM/dd/</w:t>
+        <w:t>previous</w:t>
+      </w:r>
+      <w:proofErr w:type="gramEnd"/>
+      <w:r>
+        <w:t>.</w:t>
+      </w:r>
+      <w:proofErr w:type="gramStart"/>
+      <w:r>
+        <w:t>date</w:t>
+      </w:r>
+      <w:r>
+        <w:t>.format</w:t>
+      </w:r>
+      <w:proofErr w:type="spellEnd"/>
+      <w:proofErr w:type="gramEnd"/>
+      <w:r>
+        <w:t>('MM/dd/</w:t>
       </w:r>
       <w:proofErr w:type="spellStart"/>
       <w:r>
@@ -1261,46 +1537,15 @@
       </w:r>
       <w:proofErr w:type="spellEnd"/>
       <w:r>
-        <w:t>") }}</w:t>
-      </w:r>
-      <w:r>
-        <w:t xml:space="preserve"> </w:t>
-      </w:r>
-      <w:r>
-        <w:t xml:space="preserve">and have been living in Illinois since </w:t>
-      </w:r>
-      <w:r>
-        <w:t xml:space="preserve">{{ </w:t>
-      </w:r>
-      <w:r>
-        <w:t>users[</w:t>
-      </w:r>
-      <w:proofErr w:type="spellStart"/>
-      <w:r>
-        <w:t>i</w:t>
-      </w:r>
-      <w:proofErr w:type="spellEnd"/>
-      <w:r>
-        <w:t>].</w:t>
-      </w:r>
-      <w:proofErr w:type="spellStart"/>
-      <w:r>
-        <w:t>previous.date</w:t>
-      </w:r>
-      <w:r>
-        <w:t>.format</w:t>
-      </w:r>
-      <w:proofErr w:type="spellEnd"/>
-      <w:r>
-        <w:t>('MM/dd/</w:t>
-      </w:r>
-      <w:proofErr w:type="spellStart"/>
-      <w:r>
-        <w:t>yyyy</w:t>
-      </w:r>
-      <w:proofErr w:type="spellEnd"/>
-      <w:r>
-        <w:t>') }}</w:t>
+        <w:t>'</w:t>
+      </w:r>
+      <w:proofErr w:type="gramStart"/>
+      <w:r>
+        <w:t>) }</w:t>
+      </w:r>
+      <w:proofErr w:type="gramEnd"/>
+      <w:r>
+        <w:t>}</w:t>
       </w:r>
       <w:r>
         <w:t>.</w:t>
@@ -1618,7 +1863,101 @@
         <w:spacing w:line="360" w:lineRule="auto"/>
       </w:pPr>
       <w:r>
-        <w:t xml:space="preserve">I intend to reside in Illinois, and I am currently looking for legal representation in Illinois to help me with my case. </w:t>
+        <w:t xml:space="preserve">I intend to reside in </w:t>
+      </w:r>
+      <w:proofErr w:type="gramStart"/>
+      <w:r>
+        <w:t xml:space="preserve">{{ </w:t>
+      </w:r>
+      <w:r>
+        <w:t>users</w:t>
+      </w:r>
+      <w:proofErr w:type="gramEnd"/>
+      <w:r>
+        <w:t>[</w:t>
+      </w:r>
+      <w:proofErr w:type="spellStart"/>
+      <w:r>
+        <w:t>i</w:t>
+      </w:r>
+      <w:proofErr w:type="spellEnd"/>
+      <w:proofErr w:type="gramStart"/>
+      <w:r>
+        <w:t>].</w:t>
+      </w:r>
+      <w:proofErr w:type="spellStart"/>
+      <w:r>
+        <w:t>mailing</w:t>
+      </w:r>
+      <w:proofErr w:type="gramEnd"/>
+      <w:r>
+        <w:t>_</w:t>
+      </w:r>
+      <w:proofErr w:type="gramStart"/>
+      <w:r>
+        <w:t>address.state</w:t>
+      </w:r>
+      <w:proofErr w:type="spellEnd"/>
+      <w:proofErr w:type="gramEnd"/>
+      <w:r>
+        <w:t xml:space="preserve"> </w:t>
+      </w:r>
+      <w:r>
+        <w:t>}}</w:t>
+      </w:r>
+      <w:r>
+        <w:t xml:space="preserve">, and I am currently looking for legal representation in </w:t>
+      </w:r>
+      <w:proofErr w:type="gramStart"/>
+      <w:r>
+        <w:t xml:space="preserve">{{ </w:t>
+      </w:r>
+      <w:r>
+        <w:t>users</w:t>
+      </w:r>
+      <w:proofErr w:type="gramEnd"/>
+      <w:r>
+        <w:t>[</w:t>
+      </w:r>
+      <w:proofErr w:type="spellStart"/>
+      <w:r>
+        <w:t>i</w:t>
+      </w:r>
+      <w:proofErr w:type="spellEnd"/>
+      <w:proofErr w:type="gramStart"/>
+      <w:r>
+        <w:t>].</w:t>
+      </w:r>
+      <w:proofErr w:type="spellStart"/>
+      <w:r>
+        <w:t>mailing</w:t>
+      </w:r>
+      <w:proofErr w:type="gramEnd"/>
+      <w:r>
+        <w:t>_</w:t>
+      </w:r>
+      <w:proofErr w:type="gramStart"/>
+      <w:r>
+        <w:t>address.state</w:t>
+      </w:r>
+      <w:proofErr w:type="spellEnd"/>
+      <w:proofErr w:type="gramEnd"/>
+      <w:r>
+        <w:t xml:space="preserve"> </w:t>
+      </w:r>
+      <w:r>
+        <w:t>}</w:t>
+      </w:r>
+      <w:proofErr w:type="gramStart"/>
+      <w:r>
+        <w:t xml:space="preserve">}, </w:t>
+      </w:r>
+      <w:r>
+        <w:t xml:space="preserve"> to</w:t>
+      </w:r>
+      <w:proofErr w:type="gramEnd"/>
+      <w:r>
+        <w:t xml:space="preserve"> help me with my case. </w:t>
       </w:r>
     </w:p>
     <w:p>
@@ -1641,10 +1980,18 @@
       </w:r>
       <w:proofErr w:type="gramEnd"/>
       <w:r>
-        <w:t>()</w:t>
-      </w:r>
-      <w:r>
-        <w:t>.format('MM/dd/</w:t>
+        <w:t>(</w:t>
+      </w:r>
+      <w:proofErr w:type="gramStart"/>
+      <w:r>
+        <w:t>)</w:t>
+      </w:r>
+      <w:r>
+        <w:t>.format</w:t>
+      </w:r>
+      <w:proofErr w:type="gramEnd"/>
+      <w:r>
+        <w:t>('MM/dd/</w:t>
       </w:r>
       <w:proofErr w:type="spellStart"/>
       <w:r>
@@ -1652,10 +1999,26 @@
       </w:r>
       <w:proofErr w:type="spellEnd"/>
       <w:r>
-        <w:t>') }}</w:t>
-      </w:r>
-      <w:r>
-        <w:t xml:space="preserve">, I have not appeared before an immigration judge and I have not submitted pleadings for my Notice to Appear. </w:t>
+        <w:t>'</w:t>
+      </w:r>
+      <w:proofErr w:type="gramStart"/>
+      <w:r>
+        <w:t>) }</w:t>
+      </w:r>
+      <w:proofErr w:type="gramEnd"/>
+      <w:r>
+        <w:t>}</w:t>
+      </w:r>
+      <w:r>
+        <w:t xml:space="preserve">, I have not appeared before an immigration </w:t>
+      </w:r>
+      <w:proofErr w:type="gramStart"/>
+      <w:r>
+        <w:t>judge</w:t>
+      </w:r>
+      <w:proofErr w:type="gramEnd"/>
+      <w:r>
+        <w:t xml:space="preserve"> and I have not submitted pleadings for my Notice to Appear. </w:t>
       </w:r>
     </w:p>
     <w:p>
@@ -1703,17 +2066,27 @@
         <w:t>i</w:t>
       </w:r>
       <w:proofErr w:type="spellEnd"/>
+      <w:proofErr w:type="gramStart"/>
       <w:r>
         <w:t>].</w:t>
       </w:r>
       <w:proofErr w:type="spellStart"/>
       <w:r>
-        <w:t>notice_appear_date</w:t>
+        <w:t>notice</w:t>
+      </w:r>
+      <w:proofErr w:type="gramEnd"/>
+      <w:r>
+        <w:t>_appear_</w:t>
+      </w:r>
+      <w:proofErr w:type="gramStart"/>
+      <w:r>
+        <w:t>date</w:t>
       </w:r>
       <w:r>
         <w:t>.format</w:t>
       </w:r>
       <w:proofErr w:type="spellEnd"/>
+      <w:proofErr w:type="gramEnd"/>
       <w:r>
         <w:t>(“MM/dd/</w:t>
       </w:r>
@@ -1723,13 +2096,21 @@
       </w:r>
       <w:proofErr w:type="spellEnd"/>
       <w:r>
-        <w:t>”)</w:t>
+        <w:t>”</w:t>
+      </w:r>
+      <w:proofErr w:type="gramStart"/>
+      <w:r>
+        <w:t>)</w:t>
       </w:r>
       <w:r>
         <w:t xml:space="preserve"> </w:t>
       </w:r>
       <w:r>
-        <w:t>}}</w:t>
+        <w:t>}</w:t>
+      </w:r>
+      <w:proofErr w:type="gramEnd"/>
+      <w:r>
+        <w:t>}</w:t>
       </w:r>
     </w:p>
     <w:p>
@@ -1829,6 +2210,7 @@
         <w:t>i</w:t>
       </w:r>
       <w:proofErr w:type="spellEnd"/>
+      <w:proofErr w:type="gramStart"/>
       <w:r>
         <w:rPr>
           <w:bCs/>
@@ -1840,14 +2222,35 @@
         <w:rPr>
           <w:bCs/>
         </w:rPr>
-        <w:t>type_of_relief</w:t>
-      </w:r>
-      <w:proofErr w:type="spellEnd"/>
-      <w:r>
-        <w:rPr>
-          <w:bCs/>
-        </w:rPr>
-        <w:t xml:space="preserve"> }}</w:t>
+        <w:t>type</w:t>
+      </w:r>
+      <w:proofErr w:type="gramEnd"/>
+      <w:r>
+        <w:rPr>
+          <w:bCs/>
+        </w:rPr>
+        <w:t>_of_</w:t>
+      </w:r>
+      <w:proofErr w:type="gramStart"/>
+      <w:r>
+        <w:rPr>
+          <w:bCs/>
+        </w:rPr>
+        <w:t>relief</w:t>
+      </w:r>
+      <w:proofErr w:type="spellEnd"/>
+      <w:r>
+        <w:rPr>
+          <w:bCs/>
+        </w:rPr>
+        <w:t xml:space="preserve"> }</w:t>
+      </w:r>
+      <w:proofErr w:type="gramEnd"/>
+      <w:r>
+        <w:rPr>
+          <w:bCs/>
+        </w:rPr>
+        <w:t>}</w:t>
       </w:r>
       <w:r>
         <w:t>.</w:t>
@@ -1862,7 +2265,113 @@
         <w:spacing w:line="360" w:lineRule="auto"/>
       </w:pPr>
       <w:r>
-        <w:t xml:space="preserve">I ask that the court please grant my request to change venue to Chicago, Illinois so that I can continue to reside in Illinois and attend all my court hearing in Chicago. </w:t>
+        <w:t xml:space="preserve">I ask that the court please grant my request to change venue to </w:t>
+      </w:r>
+      <w:r>
+        <w:t>{{</w:t>
+      </w:r>
+      <w:r>
+        <w:t xml:space="preserve"> </w:t>
+      </w:r>
+      <w:r>
+        <w:t>users[</w:t>
+      </w:r>
+      <w:proofErr w:type="spellStart"/>
+      <w:r>
+        <w:t>i</w:t>
+      </w:r>
+      <w:proofErr w:type="spellEnd"/>
+      <w:r>
+        <w:t>].</w:t>
+      </w:r>
+      <w:proofErr w:type="spellStart"/>
+      <w:r>
+        <w:t>dhs.address.</w:t>
+      </w:r>
+      <w:r>
+        <w:t>city</w:t>
+      </w:r>
+      <w:proofErr w:type="spellEnd"/>
+      <w:r>
+        <w:t xml:space="preserve"> </w:t>
+      </w:r>
+      <w:r>
+        <w:t>}}, {{users[</w:t>
+      </w:r>
+      <w:proofErr w:type="spellStart"/>
+      <w:r>
+        <w:t>i</w:t>
+      </w:r>
+      <w:proofErr w:type="spellEnd"/>
+      <w:r>
+        <w:t>].</w:t>
+      </w:r>
+      <w:proofErr w:type="spellStart"/>
+      <w:r>
+        <w:t>dhs.address.state</w:t>
+      </w:r>
+      <w:proofErr w:type="spellEnd"/>
+      <w:r>
+        <w:t>}}</w:t>
+      </w:r>
+      <w:r>
+        <w:t xml:space="preserve"> so that I can continue to reside in </w:t>
+      </w:r>
+      <w:r>
+        <w:t xml:space="preserve">{{ </w:t>
+      </w:r>
+      <w:r>
+        <w:t>users[</w:t>
+      </w:r>
+      <w:proofErr w:type="spellStart"/>
+      <w:r>
+        <w:t>i</w:t>
+      </w:r>
+      <w:proofErr w:type="spellEnd"/>
+      <w:r>
+        <w:t>].</w:t>
+      </w:r>
+      <w:proofErr w:type="spellStart"/>
+      <w:r>
+        <w:t>mailing_address.state</w:t>
+      </w:r>
+      <w:proofErr w:type="spellEnd"/>
+      <w:r>
+        <w:t xml:space="preserve"> </w:t>
+      </w:r>
+      <w:r>
+        <w:t xml:space="preserve">}}, </w:t>
+      </w:r>
+      <w:r>
+        <w:t xml:space="preserve"> and attend all my court hearing in </w:t>
+      </w:r>
+      <w:r>
+        <w:t xml:space="preserve">{{ </w:t>
+      </w:r>
+      <w:r>
+        <w:t>users[</w:t>
+      </w:r>
+      <w:proofErr w:type="spellStart"/>
+      <w:r>
+        <w:t>i</w:t>
+      </w:r>
+      <w:proofErr w:type="spellEnd"/>
+      <w:r>
+        <w:t>].</w:t>
+      </w:r>
+      <w:proofErr w:type="spellStart"/>
+      <w:r>
+        <w:t>dhs.address.</w:t>
+      </w:r>
+      <w:r>
+        <w:t>city</w:t>
+      </w:r>
+      <w:proofErr w:type="spellEnd"/>
+      <w:r>
+        <w:t>}}</w:t>
+      </w:r>
+      <w:r>
+        <w:t xml:space="preserve">. </w:t>
       </w:r>
     </w:p>
     <w:p>
@@ -1872,6 +2381,7 @@
     </w:p>
     <w:p>
       <w:r>
+        <w:lastRenderedPageBreak/>
         <w:t>Respectfully submitted,</w:t>
       </w:r>
       <w:r>
@@ -1890,7 +2400,6 @@
         <w:rPr>
           <w:b/>
         </w:rPr>
-        <w:lastRenderedPageBreak/>
         <w:t>________________________________</w:t>
       </w:r>
       <w:r>
@@ -2100,6 +2609,7 @@
         </w:rPr>
         <w:t>_</w:t>
       </w:r>
+      <w:proofErr w:type="gramStart"/>
       <w:r>
         <w:rPr>
           <w:bCs/>
@@ -2123,7 +2633,14 @@
         <w:rPr>
           <w:bCs/>
         </w:rPr>
-        <w:t xml:space="preserve"> }}</w:t>
+        <w:t xml:space="preserve"> }</w:t>
+      </w:r>
+      <w:proofErr w:type="gramEnd"/>
+      <w:r>
+        <w:rPr>
+          <w:bCs/>
+        </w:rPr>
+        <w:t>}</w:t>
       </w:r>
       <w:r>
         <w:t xml:space="preserve"> </w:t>
@@ -2149,7 +2666,14 @@
         <w:rPr>
           <w:bCs/>
         </w:rPr>
-        <w:t xml:space="preserve">A# {{ </w:t>
+        <w:t xml:space="preserve">A# </w:t>
+      </w:r>
+      <w:proofErr w:type="gramStart"/>
+      <w:r>
+        <w:rPr>
+          <w:bCs/>
+        </w:rPr>
+        <w:t xml:space="preserve">{{ </w:t>
       </w:r>
       <w:r>
         <w:rPr>
@@ -2157,6 +2681,7 @@
         </w:rPr>
         <w:t>users</w:t>
       </w:r>
+      <w:proofErr w:type="gramEnd"/>
       <w:r>
         <w:rPr>
           <w:bCs/>
@@ -2171,6 +2696,7 @@
         <w:t>i</w:t>
       </w:r>
       <w:proofErr w:type="spellEnd"/>
+      <w:proofErr w:type="gramStart"/>
       <w:r>
         <w:rPr>
           <w:bCs/>
@@ -2188,14 +2714,35 @@
         <w:rPr>
           <w:bCs/>
         </w:rPr>
-        <w:t>a_number</w:t>
-      </w:r>
-      <w:proofErr w:type="spellEnd"/>
-      <w:r>
-        <w:rPr>
-          <w:bCs/>
-        </w:rPr>
-        <w:t xml:space="preserve"> }}</w:t>
+        <w:t>a</w:t>
+      </w:r>
+      <w:proofErr w:type="gramEnd"/>
+      <w:r>
+        <w:rPr>
+          <w:bCs/>
+        </w:rPr>
+        <w:t>_</w:t>
+      </w:r>
+      <w:proofErr w:type="gramStart"/>
+      <w:r>
+        <w:rPr>
+          <w:bCs/>
+        </w:rPr>
+        <w:t>number</w:t>
+      </w:r>
+      <w:proofErr w:type="spellEnd"/>
+      <w:r>
+        <w:rPr>
+          <w:bCs/>
+        </w:rPr>
+        <w:t xml:space="preserve"> }</w:t>
+      </w:r>
+      <w:proofErr w:type="gramEnd"/>
+      <w:r>
+        <w:rPr>
+          <w:bCs/>
+        </w:rPr>
+        <w:t>}</w:t>
       </w:r>
     </w:p>
     <w:p/>
@@ -2357,11 +2904,27 @@
       </w:r>
       <w:proofErr w:type="gramEnd"/>
       <w:r>
-        <w:t>_checkbox</w:t>
-      </w:r>
-      <w:proofErr w:type="spellEnd"/>
-      <w:r>
-        <w:t>(False) }}</w:t>
+        <w:t>_</w:t>
+      </w:r>
+      <w:proofErr w:type="gramStart"/>
+      <w:r>
+        <w:t>checkbox</w:t>
+      </w:r>
+      <w:proofErr w:type="spellEnd"/>
+      <w:r>
+        <w:t>(</w:t>
+      </w:r>
+      <w:proofErr w:type="gramEnd"/>
+      <w:r>
+        <w:t>False</w:t>
+      </w:r>
+      <w:proofErr w:type="gramStart"/>
+      <w:r>
+        <w:t>) }</w:t>
+      </w:r>
+      <w:proofErr w:type="gramEnd"/>
+      <w:r>
+        <w:t>}</w:t>
       </w:r>
       <w:r>
         <w:rPr>
@@ -2383,16 +2946,37 @@
         </w:rPr>
         <w:t xml:space="preserve">GRANTED </w:t>
       </w:r>
+      <w:proofErr w:type="gramStart"/>
       <w:r>
         <w:t xml:space="preserve">{{ </w:t>
       </w:r>
       <w:proofErr w:type="spellStart"/>
       <w:r>
-        <w:t>output_checkbox</w:t>
-      </w:r>
-      <w:proofErr w:type="spellEnd"/>
-      <w:r>
-        <w:t>(False) }}</w:t>
+        <w:t>output</w:t>
+      </w:r>
+      <w:proofErr w:type="gramEnd"/>
+      <w:r>
+        <w:t>_</w:t>
+      </w:r>
+      <w:proofErr w:type="gramStart"/>
+      <w:r>
+        <w:t>checkbox</w:t>
+      </w:r>
+      <w:proofErr w:type="spellEnd"/>
+      <w:r>
+        <w:t>(</w:t>
+      </w:r>
+      <w:proofErr w:type="gramEnd"/>
+      <w:r>
+        <w:t>False</w:t>
+      </w:r>
+      <w:proofErr w:type="gramStart"/>
+      <w:r>
+        <w:t>) }</w:t>
+      </w:r>
+      <w:proofErr w:type="gramEnd"/>
+      <w:r>
+        <w:t>}</w:t>
       </w:r>
       <w:r>
         <w:rPr>
@@ -2451,11 +3035,27 @@
       </w:r>
       <w:proofErr w:type="gramEnd"/>
       <w:r>
-        <w:t>_checkbox</w:t>
-      </w:r>
-      <w:proofErr w:type="spellEnd"/>
-      <w:r>
-        <w:t>(False) }}</w:t>
+        <w:t>_</w:t>
+      </w:r>
+      <w:proofErr w:type="gramStart"/>
+      <w:r>
+        <w:t>checkbox</w:t>
+      </w:r>
+      <w:proofErr w:type="spellEnd"/>
+      <w:r>
+        <w:t>(</w:t>
+      </w:r>
+      <w:proofErr w:type="gramEnd"/>
+      <w:r>
+        <w:t>False</w:t>
+      </w:r>
+      <w:proofErr w:type="gramStart"/>
+      <w:r>
+        <w:t>) }</w:t>
+      </w:r>
+      <w:proofErr w:type="gramEnd"/>
+      <w:r>
+        <w:t>}</w:t>
       </w:r>
       <w:r>
         <w:t xml:space="preserve">  </w:t>
@@ -2487,11 +3087,27 @@
       </w:r>
       <w:proofErr w:type="gramEnd"/>
       <w:r>
-        <w:t>_checkbox</w:t>
-      </w:r>
-      <w:proofErr w:type="spellEnd"/>
-      <w:r>
-        <w:t>(False) }}</w:t>
+        <w:t>_</w:t>
+      </w:r>
+      <w:proofErr w:type="gramStart"/>
+      <w:r>
+        <w:t>checkbox</w:t>
+      </w:r>
+      <w:proofErr w:type="spellEnd"/>
+      <w:r>
+        <w:t>(</w:t>
+      </w:r>
+      <w:proofErr w:type="gramEnd"/>
+      <w:r>
+        <w:t>False</w:t>
+      </w:r>
+      <w:proofErr w:type="gramStart"/>
+      <w:r>
+        <w:t>) }</w:t>
+      </w:r>
+      <w:proofErr w:type="gramEnd"/>
+      <w:r>
+        <w:t>}</w:t>
       </w:r>
       <w:r>
         <w:t xml:space="preserve">  </w:t>
@@ -2523,11 +3139,27 @@
       </w:r>
       <w:proofErr w:type="gramEnd"/>
       <w:r>
-        <w:t>_checkbox</w:t>
-      </w:r>
-      <w:proofErr w:type="spellEnd"/>
-      <w:r>
-        <w:t>(False) }}</w:t>
+        <w:t>_</w:t>
+      </w:r>
+      <w:proofErr w:type="gramStart"/>
+      <w:r>
+        <w:t>checkbox</w:t>
+      </w:r>
+      <w:proofErr w:type="spellEnd"/>
+      <w:r>
+        <w:t>(</w:t>
+      </w:r>
+      <w:proofErr w:type="gramEnd"/>
+      <w:r>
+        <w:t>False</w:t>
+      </w:r>
+      <w:proofErr w:type="gramStart"/>
+      <w:r>
+        <w:t>) }</w:t>
+      </w:r>
+      <w:proofErr w:type="gramEnd"/>
+      <w:r>
+        <w:t>}</w:t>
       </w:r>
       <w:r>
         <w:t xml:space="preserve">  </w:t>
@@ -2559,11 +3191,27 @@
       </w:r>
       <w:proofErr w:type="gramEnd"/>
       <w:r>
-        <w:t>_checkbox</w:t>
-      </w:r>
-      <w:proofErr w:type="spellEnd"/>
-      <w:r>
-        <w:t>(False) }}</w:t>
+        <w:t>_</w:t>
+      </w:r>
+      <w:proofErr w:type="gramStart"/>
+      <w:r>
+        <w:t>checkbox</w:t>
+      </w:r>
+      <w:proofErr w:type="spellEnd"/>
+      <w:r>
+        <w:t>(</w:t>
+      </w:r>
+      <w:proofErr w:type="gramEnd"/>
+      <w:r>
+        <w:t>False</w:t>
+      </w:r>
+      <w:proofErr w:type="gramStart"/>
+      <w:r>
+        <w:t>) }</w:t>
+      </w:r>
+      <w:proofErr w:type="gramEnd"/>
+      <w:r>
+        <w:t>}</w:t>
       </w:r>
       <w:r>
         <w:t xml:space="preserve">  </w:t>
@@ -2595,11 +3243,27 @@
       </w:r>
       <w:proofErr w:type="gramEnd"/>
       <w:r>
-        <w:t>_checkbox</w:t>
-      </w:r>
-      <w:proofErr w:type="spellEnd"/>
-      <w:r>
-        <w:t>(False) }}</w:t>
+        <w:t>_</w:t>
+      </w:r>
+      <w:proofErr w:type="gramStart"/>
+      <w:r>
+        <w:t>checkbox</w:t>
+      </w:r>
+      <w:proofErr w:type="spellEnd"/>
+      <w:r>
+        <w:t>(</w:t>
+      </w:r>
+      <w:proofErr w:type="gramEnd"/>
+      <w:r>
+        <w:t>False</w:t>
+      </w:r>
+      <w:proofErr w:type="gramStart"/>
+      <w:r>
+        <w:t>) }</w:t>
+      </w:r>
+      <w:proofErr w:type="gramEnd"/>
+      <w:r>
+        <w:t>}</w:t>
       </w:r>
       <w:r>
         <w:t xml:space="preserve">  </w:t>
@@ -2631,11 +3295,27 @@
       </w:r>
       <w:proofErr w:type="gramEnd"/>
       <w:r>
-        <w:t>_checkbox</w:t>
-      </w:r>
-      <w:proofErr w:type="spellEnd"/>
-      <w:r>
-        <w:t>(False) }}</w:t>
+        <w:t>_</w:t>
+      </w:r>
+      <w:proofErr w:type="gramStart"/>
+      <w:r>
+        <w:t>checkbox</w:t>
+      </w:r>
+      <w:proofErr w:type="spellEnd"/>
+      <w:r>
+        <w:t>(</w:t>
+      </w:r>
+      <w:proofErr w:type="gramEnd"/>
+      <w:r>
+        <w:t>False</w:t>
+      </w:r>
+      <w:proofErr w:type="gramStart"/>
+      <w:r>
+        <w:t>) }</w:t>
+      </w:r>
+      <w:proofErr w:type="gramEnd"/>
+      <w:r>
+        <w:t>}</w:t>
       </w:r>
       <w:r>
         <w:t xml:space="preserve">  </w:t>
@@ -2667,11 +3347,27 @@
       </w:r>
       <w:proofErr w:type="gramEnd"/>
       <w:r>
-        <w:t>_checkbox</w:t>
-      </w:r>
-      <w:proofErr w:type="spellEnd"/>
-      <w:r>
-        <w:t>(False) }}</w:t>
+        <w:t>_</w:t>
+      </w:r>
+      <w:proofErr w:type="gramStart"/>
+      <w:r>
+        <w:t>checkbox</w:t>
+      </w:r>
+      <w:proofErr w:type="spellEnd"/>
+      <w:r>
+        <w:t>(</w:t>
+      </w:r>
+      <w:proofErr w:type="gramEnd"/>
+      <w:r>
+        <w:t>False</w:t>
+      </w:r>
+      <w:proofErr w:type="gramStart"/>
+      <w:r>
+        <w:t>) }</w:t>
+      </w:r>
+      <w:proofErr w:type="gramEnd"/>
+      <w:r>
+        <w:t>}</w:t>
       </w:r>
       <w:r>
         <w:t xml:space="preserve">  </w:t>
@@ -2740,11 +3436,27 @@
       </w:r>
       <w:proofErr w:type="gramEnd"/>
       <w:r>
-        <w:t>_checkbox</w:t>
-      </w:r>
-      <w:proofErr w:type="spellEnd"/>
-      <w:r>
-        <w:t>(False) }}</w:t>
+        <w:t>_</w:t>
+      </w:r>
+      <w:proofErr w:type="gramStart"/>
+      <w:r>
+        <w:t>checkbox</w:t>
+      </w:r>
+      <w:proofErr w:type="spellEnd"/>
+      <w:r>
+        <w:t>(</w:t>
+      </w:r>
+      <w:proofErr w:type="gramEnd"/>
+      <w:r>
+        <w:t>False</w:t>
+      </w:r>
+      <w:proofErr w:type="gramStart"/>
+      <w:r>
+        <w:t>) }</w:t>
+      </w:r>
+      <w:proofErr w:type="gramEnd"/>
+      <w:r>
+        <w:t>}</w:t>
       </w:r>
       <w:r>
         <w:t xml:space="preserve">  </w:t>
@@ -2776,11 +3488,27 @@
       </w:r>
       <w:proofErr w:type="gramEnd"/>
       <w:r>
-        <w:t>_checkbox</w:t>
-      </w:r>
-      <w:proofErr w:type="spellEnd"/>
-      <w:r>
-        <w:t>(False) }}</w:t>
+        <w:t>_</w:t>
+      </w:r>
+      <w:proofErr w:type="gramStart"/>
+      <w:r>
+        <w:t>checkbox</w:t>
+      </w:r>
+      <w:proofErr w:type="spellEnd"/>
+      <w:r>
+        <w:t>(</w:t>
+      </w:r>
+      <w:proofErr w:type="gramEnd"/>
+      <w:r>
+        <w:t>False</w:t>
+      </w:r>
+      <w:proofErr w:type="gramStart"/>
+      <w:r>
+        <w:t>) }</w:t>
+      </w:r>
+      <w:proofErr w:type="gramEnd"/>
+      <w:r>
+        <w:t>}</w:t>
       </w:r>
       <w:r>
         <w:t xml:space="preserve">  </w:t>
@@ -3021,7 +3749,77 @@
         <w:rPr>
           <w:rFonts w:eastAsia="Calibri"/>
         </w:rPr>
-        <w:t xml:space="preserve">   )   PERSONAL SERVICE (     )   ELECTRONIC SERVICE (     ) </w:t>
+        <w:t xml:space="preserve"> </w:t>
+      </w:r>
+      <w:proofErr w:type="gramStart"/>
+      <w:r>
+        <w:rPr>
+          <w:rFonts w:eastAsia="Calibri"/>
+        </w:rPr>
+        <w:t xml:space="preserve">  )</w:t>
+      </w:r>
+      <w:proofErr w:type="gramEnd"/>
+      <w:r>
+        <w:rPr>
+          <w:rFonts w:eastAsia="Calibri"/>
+        </w:rPr>
+        <w:t xml:space="preserve">   PERSONAL SERVICE </w:t>
+      </w:r>
+      <w:proofErr w:type="gramStart"/>
+      <w:r>
+        <w:rPr>
+          <w:rFonts w:eastAsia="Calibri"/>
+        </w:rPr>
+        <w:t xml:space="preserve">(  </w:t>
+      </w:r>
+      <w:proofErr w:type="gramEnd"/>
+      <w:r>
+        <w:rPr>
+          <w:rFonts w:eastAsia="Calibri"/>
+        </w:rPr>
+        <w:t xml:space="preserve"> </w:t>
+      </w:r>
+      <w:proofErr w:type="gramStart"/>
+      <w:r>
+        <w:rPr>
+          <w:rFonts w:eastAsia="Calibri"/>
+        </w:rPr>
+        <w:t xml:space="preserve">  )</w:t>
+      </w:r>
+      <w:proofErr w:type="gramEnd"/>
+      <w:r>
+        <w:rPr>
+          <w:rFonts w:eastAsia="Calibri"/>
+        </w:rPr>
+        <w:t xml:space="preserve">   ELECTRONIC SERVICE </w:t>
+      </w:r>
+      <w:proofErr w:type="gramStart"/>
+      <w:r>
+        <w:rPr>
+          <w:rFonts w:eastAsia="Calibri"/>
+        </w:rPr>
+        <w:t xml:space="preserve">(  </w:t>
+      </w:r>
+      <w:proofErr w:type="gramEnd"/>
+      <w:r>
+        <w:rPr>
+          <w:rFonts w:eastAsia="Calibri"/>
+        </w:rPr>
+        <w:t xml:space="preserve"> </w:t>
+      </w:r>
+      <w:proofErr w:type="gramStart"/>
+      <w:r>
+        <w:rPr>
+          <w:rFonts w:eastAsia="Calibri"/>
+        </w:rPr>
+        <w:t xml:space="preserve">  )</w:t>
+      </w:r>
+      <w:proofErr w:type="gramEnd"/>
+      <w:r>
+        <w:rPr>
+          <w:rFonts w:eastAsia="Calibri"/>
+        </w:rPr>
+        <w:t xml:space="preserve"> </w:t>
       </w:r>
     </w:p>
     <w:p>
@@ -3053,7 +3851,105 @@
         <w:rPr>
           <w:rFonts w:eastAsia="Calibri"/>
         </w:rPr>
-        <w:t xml:space="preserve">   )    RESPONDENT’S C/O CUSTODIAL OFFICER (     )   RESPONDENT’S ATTY/REP (     )    DHS (     ) </w:t>
+        <w:t xml:space="preserve"> </w:t>
+      </w:r>
+      <w:proofErr w:type="gramStart"/>
+      <w:r>
+        <w:rPr>
+          <w:rFonts w:eastAsia="Calibri"/>
+        </w:rPr>
+        <w:t xml:space="preserve">  )</w:t>
+      </w:r>
+      <w:proofErr w:type="gramEnd"/>
+      <w:r>
+        <w:rPr>
+          <w:rFonts w:eastAsia="Calibri"/>
+        </w:rPr>
+        <w:t xml:space="preserve">    RESPONDENT’S C/O CUSTODIAL OFFICER </w:t>
+      </w:r>
+      <w:proofErr w:type="gramStart"/>
+      <w:r>
+        <w:rPr>
+          <w:rFonts w:eastAsia="Calibri"/>
+        </w:rPr>
+        <w:t xml:space="preserve">(  </w:t>
+      </w:r>
+      <w:proofErr w:type="gramEnd"/>
+      <w:r>
+        <w:rPr>
+          <w:rFonts w:eastAsia="Calibri"/>
+        </w:rPr>
+        <w:t xml:space="preserve"> </w:t>
+      </w:r>
+      <w:proofErr w:type="gramStart"/>
+      <w:r>
+        <w:rPr>
+          <w:rFonts w:eastAsia="Calibri"/>
+        </w:rPr>
+        <w:t xml:space="preserve">  )</w:t>
+      </w:r>
+      <w:proofErr w:type="gramEnd"/>
+      <w:r>
+        <w:rPr>
+          <w:rFonts w:eastAsia="Calibri"/>
+        </w:rPr>
+        <w:t xml:space="preserve">   RESPONDENT’S ATTY/REP </w:t>
+      </w:r>
+      <w:proofErr w:type="gramStart"/>
+      <w:r>
+        <w:rPr>
+          <w:rFonts w:eastAsia="Calibri"/>
+        </w:rPr>
+        <w:t xml:space="preserve">(  </w:t>
+      </w:r>
+      <w:proofErr w:type="gramEnd"/>
+      <w:r>
+        <w:rPr>
+          <w:rFonts w:eastAsia="Calibri"/>
+        </w:rPr>
+        <w:t xml:space="preserve"> </w:t>
+      </w:r>
+      <w:proofErr w:type="gramStart"/>
+      <w:r>
+        <w:rPr>
+          <w:rFonts w:eastAsia="Calibri"/>
+        </w:rPr>
+        <w:t xml:space="preserve">  )</w:t>
+      </w:r>
+      <w:proofErr w:type="gramEnd"/>
+      <w:r>
+        <w:rPr>
+          <w:rFonts w:eastAsia="Calibri"/>
+        </w:rPr>
+        <w:t xml:space="preserve">    DHS </w:t>
+      </w:r>
+      <w:proofErr w:type="gramStart"/>
+      <w:r>
+        <w:rPr>
+          <w:rFonts w:eastAsia="Calibri"/>
+        </w:rPr>
+        <w:t xml:space="preserve">(  </w:t>
+      </w:r>
+      <w:proofErr w:type="gramEnd"/>
+      <w:r>
+        <w:rPr>
+          <w:rFonts w:eastAsia="Calibri"/>
+        </w:rPr>
+        <w:t xml:space="preserve"> </w:t>
+      </w:r>
+      <w:proofErr w:type="gramStart"/>
+      <w:r>
+        <w:rPr>
+          <w:rFonts w:eastAsia="Calibri"/>
+        </w:rPr>
+        <w:t xml:space="preserve">  )</w:t>
+      </w:r>
+      <w:proofErr w:type="gramEnd"/>
+      <w:r>
+        <w:rPr>
+          <w:rFonts w:eastAsia="Calibri"/>
+        </w:rPr>
+        <w:t xml:space="preserve"> </w:t>
       </w:r>
     </w:p>
     <w:p>
@@ -3109,7 +4005,49 @@
         <w:rPr>
           <w:rFonts w:eastAsia="Calibri"/>
         </w:rPr>
-        <w:t xml:space="preserve">   )   EOIR-28 (    )   LEGAL SERVICES LIST (   )    OTHER</w:t>
+        <w:t xml:space="preserve"> </w:t>
+      </w:r>
+      <w:proofErr w:type="gramStart"/>
+      <w:r>
+        <w:rPr>
+          <w:rFonts w:eastAsia="Calibri"/>
+        </w:rPr>
+        <w:t xml:space="preserve">  )</w:t>
+      </w:r>
+      <w:proofErr w:type="gramEnd"/>
+      <w:r>
+        <w:rPr>
+          <w:rFonts w:eastAsia="Calibri"/>
+        </w:rPr>
+        <w:t xml:space="preserve">   EOIR-28 </w:t>
+      </w:r>
+      <w:proofErr w:type="gramStart"/>
+      <w:r>
+        <w:rPr>
+          <w:rFonts w:eastAsia="Calibri"/>
+        </w:rPr>
+        <w:t>(    )</w:t>
+      </w:r>
+      <w:proofErr w:type="gramEnd"/>
+      <w:r>
+        <w:rPr>
+          <w:rFonts w:eastAsia="Calibri"/>
+        </w:rPr>
+        <w:t xml:space="preserve">   LEGAL SERVICES LIST </w:t>
+      </w:r>
+      <w:proofErr w:type="gramStart"/>
+      <w:r>
+        <w:rPr>
+          <w:rFonts w:eastAsia="Calibri"/>
+        </w:rPr>
+        <w:t xml:space="preserve">(  </w:t>
+      </w:r>
+      <w:proofErr w:type="gramEnd"/>
+      <w:r>
+        <w:rPr>
+          <w:rFonts w:eastAsia="Calibri"/>
+        </w:rPr>
+        <w:t xml:space="preserve"> )    OTHER</w:t>
       </w:r>
     </w:p>
     <w:p>
@@ -3210,6 +4148,7 @@
         </w:rPr>
         <w:t>_</w:t>
       </w:r>
+      <w:proofErr w:type="gramStart"/>
       <w:r>
         <w:rPr>
           <w:bCs/>
@@ -3233,7 +4172,14 @@
         <w:rPr>
           <w:bCs/>
         </w:rPr>
-        <w:t xml:space="preserve"> }}</w:t>
+        <w:t xml:space="preserve"> }</w:t>
+      </w:r>
+      <w:proofErr w:type="gramEnd"/>
+      <w:r>
+        <w:rPr>
+          <w:bCs/>
+        </w:rPr>
+        <w:t>}</w:t>
       </w:r>
       <w:r>
         <w:t xml:space="preserve"> </w:t>
@@ -3258,7 +4204,14 @@
         <w:rPr>
           <w:bCs/>
         </w:rPr>
-        <w:t xml:space="preserve">A# {{ </w:t>
+        <w:t xml:space="preserve">A# </w:t>
+      </w:r>
+      <w:proofErr w:type="gramStart"/>
+      <w:r>
+        <w:rPr>
+          <w:bCs/>
+        </w:rPr>
+        <w:t xml:space="preserve">{{ </w:t>
       </w:r>
       <w:r>
         <w:rPr>
@@ -3266,6 +4219,7 @@
         </w:rPr>
         <w:t>users</w:t>
       </w:r>
+      <w:proofErr w:type="gramEnd"/>
       <w:r>
         <w:rPr>
           <w:bCs/>
@@ -3280,6 +4234,7 @@
         <w:t>i</w:t>
       </w:r>
       <w:proofErr w:type="spellEnd"/>
+      <w:proofErr w:type="gramStart"/>
       <w:r>
         <w:rPr>
           <w:bCs/>
@@ -3297,14 +4252,35 @@
         <w:rPr>
           <w:bCs/>
         </w:rPr>
-        <w:t>a_number</w:t>
-      </w:r>
-      <w:proofErr w:type="spellEnd"/>
-      <w:r>
-        <w:rPr>
-          <w:bCs/>
-        </w:rPr>
-        <w:t xml:space="preserve"> }}</w:t>
+        <w:t>a</w:t>
+      </w:r>
+      <w:proofErr w:type="gramEnd"/>
+      <w:r>
+        <w:rPr>
+          <w:bCs/>
+        </w:rPr>
+        <w:t>_</w:t>
+      </w:r>
+      <w:proofErr w:type="gramStart"/>
+      <w:r>
+        <w:rPr>
+          <w:bCs/>
+        </w:rPr>
+        <w:t>number</w:t>
+      </w:r>
+      <w:proofErr w:type="spellEnd"/>
+      <w:r>
+        <w:rPr>
+          <w:bCs/>
+        </w:rPr>
+        <w:t xml:space="preserve"> }</w:t>
+      </w:r>
+      <w:proofErr w:type="gramEnd"/>
+      <w:r>
+        <w:rPr>
+          <w:bCs/>
+        </w:rPr>
+        <w:t>}</w:t>
       </w:r>
     </w:p>
     <w:p>
@@ -3841,7 +4817,7 @@
 </file>
 
 <file path=word/endnotes.xml><?xml version="1.0" encoding="utf-8"?>
-<w:endnotes xmlns:wpc="http://schemas.microsoft.com/office/word/2010/wordprocessingCanvas" xmlns:cx="http://schemas.microsoft.com/office/drawing/2014/chartex" xmlns:cx1="http://schemas.microsoft.com/office/drawing/2015/9/8/chartex" xmlns:cx2="http://schemas.microsoft.com/office/drawing/2015/10/21/chartex" xmlns:cx3="http://schemas.microsoft.com/office/drawing/2016/5/9/chartex" xmlns:cx4="http://schemas.microsoft.com/office/drawing/2016/5/10/chartex" xmlns:cx5="http://schemas.microsoft.com/office/drawing/2016/5/11/chartex" xmlns:cx6="http://schemas.microsoft.com/office/drawing/2016/5/12/chartex" xmlns:cx7="http://schemas.microsoft.com/office/drawing/2016/5/13/chartex" xmlns:cx8="http://schemas.microsoft.com/office/drawing/2016/5/14/chartex" xmlns:mc="http://schemas.openxmlformats.org/markup-compatibility/2006" xmlns:aink="http://schemas.microsoft.com/office/drawing/2016/ink" xmlns:am3d="http://schemas.microsoft.com/office/drawing/2017/model3d" xmlns:o="urn:schemas-microsoft-com:office:office" xmlns:oel="http://schemas.microsoft.com/office/2019/extlst" xmlns:r="http://schemas.openxmlformats.org/officeDocument/2006/relationships" xmlns:m="http://schemas.openxmlformats.org/officeDocument/2006/math" xmlns:v="urn:schemas-microsoft-com:vml" xmlns:wp14="http://schemas.microsoft.com/office/word/2010/wordprocessingDrawing" xmlns:wp="http://schemas.openxmlformats.org/drawingml/2006/wordprocessingDrawing" xmlns:w10="urn:schemas-microsoft-com:office:word" xmlns:w="http://schemas.openxmlformats.org/wordprocessingml/2006/main" xmlns:w14="http://schemas.microsoft.com/office/word/2010/wordml" xmlns:w15="http://schemas.microsoft.com/office/word/2012/wordml" xmlns:w16cex="http://schemas.microsoft.com/office/word/2018/wordml/cex" xmlns:w16cid="http://schemas.microsoft.com/office/word/2016/wordml/cid" xmlns:w16="http://schemas.microsoft.com/office/word/2018/wordml" xmlns:w16sdtdh="http://schemas.microsoft.com/office/word/2020/wordml/sdtdatahash" xmlns:w16se="http://schemas.microsoft.com/office/word/2015/wordml/symex" xmlns:wpg="http://schemas.microsoft.com/office/word/2010/wordprocessingGroup" xmlns:wpi="http://schemas.microsoft.com/office/word/2010/wordprocessingInk" xmlns:wne="http://schemas.microsoft.com/office/word/2006/wordml" xmlns:wps="http://schemas.microsoft.com/office/word/2010/wordprocessingShape" mc:Ignorable="w14 w15 w16se w16cid w16 w16cex w16sdtdh wp14">
+<w:endnotes xmlns:wpc="http://schemas.microsoft.com/office/word/2010/wordprocessingCanvas" xmlns:cx="http://schemas.microsoft.com/office/drawing/2014/chartex" xmlns:cx1="http://schemas.microsoft.com/office/drawing/2015/9/8/chartex" xmlns:cx2="http://schemas.microsoft.com/office/drawing/2015/10/21/chartex" xmlns:cx3="http://schemas.microsoft.com/office/drawing/2016/5/9/chartex" xmlns:cx4="http://schemas.microsoft.com/office/drawing/2016/5/10/chartex" xmlns:cx5="http://schemas.microsoft.com/office/drawing/2016/5/11/chartex" xmlns:cx6="http://schemas.microsoft.com/office/drawing/2016/5/12/chartex" xmlns:cx7="http://schemas.microsoft.com/office/drawing/2016/5/13/chartex" xmlns:cx8="http://schemas.microsoft.com/office/drawing/2016/5/14/chartex" xmlns:mc="http://schemas.openxmlformats.org/markup-compatibility/2006" xmlns:aink="http://schemas.microsoft.com/office/drawing/2016/ink" xmlns:am3d="http://schemas.microsoft.com/office/drawing/2017/model3d" xmlns:o="urn:schemas-microsoft-com:office:office" xmlns:oel="http://schemas.microsoft.com/office/2019/extlst" xmlns:r="http://schemas.openxmlformats.org/officeDocument/2006/relationships" xmlns:m="http://schemas.openxmlformats.org/officeDocument/2006/math" xmlns:v="urn:schemas-microsoft-com:vml" xmlns:wp14="http://schemas.microsoft.com/office/word/2010/wordprocessingDrawing" xmlns:wp="http://schemas.openxmlformats.org/drawingml/2006/wordprocessingDrawing" xmlns:w10="urn:schemas-microsoft-com:office:word" xmlns:w="http://schemas.openxmlformats.org/wordprocessingml/2006/main" xmlns:w14="http://schemas.microsoft.com/office/word/2010/wordml" xmlns:w15="http://schemas.microsoft.com/office/word/2012/wordml" xmlns:w16cex="http://schemas.microsoft.com/office/word/2018/wordml/cex" xmlns:w16cid="http://schemas.microsoft.com/office/word/2016/wordml/cid" xmlns:w16="http://schemas.microsoft.com/office/word/2018/wordml" xmlns:w16du="http://schemas.microsoft.com/office/word/2023/wordml/word16du" xmlns:w16sdtdh="http://schemas.microsoft.com/office/word/2020/wordml/sdtdatahash" xmlns:w16sdtfl="http://schemas.microsoft.com/office/word/2024/wordml/sdtformatlock" xmlns:w16se="http://schemas.microsoft.com/office/word/2015/wordml/symex" xmlns:wpg="http://schemas.microsoft.com/office/word/2010/wordprocessingGroup" xmlns:wpi="http://schemas.microsoft.com/office/word/2010/wordprocessingInk" xmlns:wne="http://schemas.microsoft.com/office/word/2006/wordml" xmlns:wps="http://schemas.microsoft.com/office/word/2010/wordprocessingShape" mc:Ignorable="w14 w15 w16se w16cid w16 w16cex w16sdtdh w16sdtfl w16du wp14">
   <w:endnote w:type="separator" w:id="-1">
     <w:p>
       <w:r>
@@ -3860,7 +4836,7 @@
 </file>
 
 <file path=word/footnotes.xml><?xml version="1.0" encoding="utf-8"?>
-<w:footnotes xmlns:wpc="http://schemas.microsoft.com/office/word/2010/wordprocessingCanvas" xmlns:cx="http://schemas.microsoft.com/office/drawing/2014/chartex" xmlns:cx1="http://schemas.microsoft.com/office/drawing/2015/9/8/chartex" xmlns:cx2="http://schemas.microsoft.com/office/drawing/2015/10/21/chartex" xmlns:cx3="http://schemas.microsoft.com/office/drawing/2016/5/9/chartex" xmlns:cx4="http://schemas.microsoft.com/office/drawing/2016/5/10/chartex" xmlns:cx5="http://schemas.microsoft.com/office/drawing/2016/5/11/chartex" xmlns:cx6="http://schemas.microsoft.com/office/drawing/2016/5/12/chartex" xmlns:cx7="http://schemas.microsoft.com/office/drawing/2016/5/13/chartex" xmlns:cx8="http://schemas.microsoft.com/office/drawing/2016/5/14/chartex" xmlns:mc="http://schemas.openxmlformats.org/markup-compatibility/2006" xmlns:aink="http://schemas.microsoft.com/office/drawing/2016/ink" xmlns:am3d="http://schemas.microsoft.com/office/drawing/2017/model3d" xmlns:o="urn:schemas-microsoft-com:office:office" xmlns:oel="http://schemas.microsoft.com/office/2019/extlst" xmlns:r="http://schemas.openxmlformats.org/officeDocument/2006/relationships" xmlns:m="http://schemas.openxmlformats.org/officeDocument/2006/math" xmlns:v="urn:schemas-microsoft-com:vml" xmlns:wp14="http://schemas.microsoft.com/office/word/2010/wordprocessingDrawing" xmlns:wp="http://schemas.openxmlformats.org/drawingml/2006/wordprocessingDrawing" xmlns:w10="urn:schemas-microsoft-com:office:word" xmlns:w="http://schemas.openxmlformats.org/wordprocessingml/2006/main" xmlns:w14="http://schemas.microsoft.com/office/word/2010/wordml" xmlns:w15="http://schemas.microsoft.com/office/word/2012/wordml" xmlns:w16cex="http://schemas.microsoft.com/office/word/2018/wordml/cex" xmlns:w16cid="http://schemas.microsoft.com/office/word/2016/wordml/cid" xmlns:w16="http://schemas.microsoft.com/office/word/2018/wordml" xmlns:w16sdtdh="http://schemas.microsoft.com/office/word/2020/wordml/sdtdatahash" xmlns:w16se="http://schemas.microsoft.com/office/word/2015/wordml/symex" xmlns:wpg="http://schemas.microsoft.com/office/word/2010/wordprocessingGroup" xmlns:wpi="http://schemas.microsoft.com/office/word/2010/wordprocessingInk" xmlns:wne="http://schemas.microsoft.com/office/word/2006/wordml" xmlns:wps="http://schemas.microsoft.com/office/word/2010/wordprocessingShape" mc:Ignorable="w14 w15 w16se w16cid w16 w16cex w16sdtdh wp14">
+<w:footnotes xmlns:wpc="http://schemas.microsoft.com/office/word/2010/wordprocessingCanvas" xmlns:cx="http://schemas.microsoft.com/office/drawing/2014/chartex" xmlns:cx1="http://schemas.microsoft.com/office/drawing/2015/9/8/chartex" xmlns:cx2="http://schemas.microsoft.com/office/drawing/2015/10/21/chartex" xmlns:cx3="http://schemas.microsoft.com/office/drawing/2016/5/9/chartex" xmlns:cx4="http://schemas.microsoft.com/office/drawing/2016/5/10/chartex" xmlns:cx5="http://schemas.microsoft.com/office/drawing/2016/5/11/chartex" xmlns:cx6="http://schemas.microsoft.com/office/drawing/2016/5/12/chartex" xmlns:cx7="http://schemas.microsoft.com/office/drawing/2016/5/13/chartex" xmlns:cx8="http://schemas.microsoft.com/office/drawing/2016/5/14/chartex" xmlns:mc="http://schemas.openxmlformats.org/markup-compatibility/2006" xmlns:aink="http://schemas.microsoft.com/office/drawing/2016/ink" xmlns:am3d="http://schemas.microsoft.com/office/drawing/2017/model3d" xmlns:o="urn:schemas-microsoft-com:office:office" xmlns:oel="http://schemas.microsoft.com/office/2019/extlst" xmlns:r="http://schemas.openxmlformats.org/officeDocument/2006/relationships" xmlns:m="http://schemas.openxmlformats.org/officeDocument/2006/math" xmlns:v="urn:schemas-microsoft-com:vml" xmlns:wp14="http://schemas.microsoft.com/office/word/2010/wordprocessingDrawing" xmlns:wp="http://schemas.openxmlformats.org/drawingml/2006/wordprocessingDrawing" xmlns:w10="urn:schemas-microsoft-com:office:word" xmlns:w="http://schemas.openxmlformats.org/wordprocessingml/2006/main" xmlns:w14="http://schemas.microsoft.com/office/word/2010/wordml" xmlns:w15="http://schemas.microsoft.com/office/word/2012/wordml" xmlns:w16cex="http://schemas.microsoft.com/office/word/2018/wordml/cex" xmlns:w16cid="http://schemas.microsoft.com/office/word/2016/wordml/cid" xmlns:w16="http://schemas.microsoft.com/office/word/2018/wordml" xmlns:w16du="http://schemas.microsoft.com/office/word/2023/wordml/word16du" xmlns:w16sdtdh="http://schemas.microsoft.com/office/word/2020/wordml/sdtdatahash" xmlns:w16sdtfl="http://schemas.microsoft.com/office/word/2024/wordml/sdtformatlock" xmlns:w16se="http://schemas.microsoft.com/office/word/2015/wordml/symex" xmlns:wpg="http://schemas.microsoft.com/office/word/2010/wordprocessingGroup" xmlns:wpi="http://schemas.microsoft.com/office/word/2010/wordprocessingInk" xmlns:wne="http://schemas.microsoft.com/office/word/2006/wordml" xmlns:wps="http://schemas.microsoft.com/office/word/2010/wordprocessingShape" mc:Ignorable="w14 w15 w16se w16cid w16 w16cex w16sdtdh w16sdtfl w16du wp14">
   <w:footnote w:type="separator" w:id="-1">
     <w:p>
       <w:r>
@@ -3879,7 +4855,7 @@
 </file>
 
 <file path=word/numbering.xml><?xml version="1.0" encoding="utf-8"?>
-<w:numbering xmlns:wpc="http://schemas.microsoft.com/office/word/2010/wordprocessingCanvas" xmlns:cx="http://schemas.microsoft.com/office/drawing/2014/chartex" xmlns:cx1="http://schemas.microsoft.com/office/drawing/2015/9/8/chartex" xmlns:cx2="http://schemas.microsoft.com/office/drawing/2015/10/21/chartex" xmlns:cx3="http://schemas.microsoft.com/office/drawing/2016/5/9/chartex" xmlns:cx4="http://schemas.microsoft.com/office/drawing/2016/5/10/chartex" xmlns:cx5="http://schemas.microsoft.com/office/drawing/2016/5/11/chartex" xmlns:cx6="http://schemas.microsoft.com/office/drawing/2016/5/12/chartex" xmlns:cx7="http://schemas.microsoft.com/office/drawing/2016/5/13/chartex" xmlns:cx8="http://schemas.microsoft.com/office/drawing/2016/5/14/chartex" xmlns:mc="http://schemas.openxmlformats.org/markup-compatibility/2006" xmlns:aink="http://schemas.microsoft.com/office/drawing/2016/ink" xmlns:am3d="http://schemas.microsoft.com/office/drawing/2017/model3d" xmlns:o="urn:schemas-microsoft-com:office:office" xmlns:oel="http://schemas.microsoft.com/office/2019/extlst" xmlns:r="http://schemas.openxmlformats.org/officeDocument/2006/relationships" xmlns:m="http://schemas.openxmlformats.org/officeDocument/2006/math" xmlns:v="urn:schemas-microsoft-com:vml" xmlns:wp14="http://schemas.microsoft.com/office/word/2010/wordprocessingDrawing" xmlns:wp="http://schemas.openxmlformats.org/drawingml/2006/wordprocessingDrawing" xmlns:w10="urn:schemas-microsoft-com:office:word" xmlns:w="http://schemas.openxmlformats.org/wordprocessingml/2006/main" xmlns:w14="http://schemas.microsoft.com/office/word/2010/wordml" xmlns:w15="http://schemas.microsoft.com/office/word/2012/wordml" xmlns:w16cex="http://schemas.microsoft.com/office/word/2018/wordml/cex" xmlns:w16cid="http://schemas.microsoft.com/office/word/2016/wordml/cid" xmlns:w16="http://schemas.microsoft.com/office/word/2018/wordml" xmlns:w16sdtdh="http://schemas.microsoft.com/office/word/2020/wordml/sdtdatahash" xmlns:w16se="http://schemas.microsoft.com/office/word/2015/wordml/symex" xmlns:wpg="http://schemas.microsoft.com/office/word/2010/wordprocessingGroup" xmlns:wpi="http://schemas.microsoft.com/office/word/2010/wordprocessingInk" xmlns:wne="http://schemas.microsoft.com/office/word/2006/wordml" xmlns:wps="http://schemas.microsoft.com/office/word/2010/wordprocessingShape" mc:Ignorable="w14 w15 w16se w16cid w16 w16cex w16sdtdh wp14">
+<w:numbering xmlns:wpc="http://schemas.microsoft.com/office/word/2010/wordprocessingCanvas" xmlns:cx="http://schemas.microsoft.com/office/drawing/2014/chartex" xmlns:cx1="http://schemas.microsoft.com/office/drawing/2015/9/8/chartex" xmlns:cx2="http://schemas.microsoft.com/office/drawing/2015/10/21/chartex" xmlns:cx3="http://schemas.microsoft.com/office/drawing/2016/5/9/chartex" xmlns:cx4="http://schemas.microsoft.com/office/drawing/2016/5/10/chartex" xmlns:cx5="http://schemas.microsoft.com/office/drawing/2016/5/11/chartex" xmlns:cx6="http://schemas.microsoft.com/office/drawing/2016/5/12/chartex" xmlns:cx7="http://schemas.microsoft.com/office/drawing/2016/5/13/chartex" xmlns:cx8="http://schemas.microsoft.com/office/drawing/2016/5/14/chartex" xmlns:mc="http://schemas.openxmlformats.org/markup-compatibility/2006" xmlns:aink="http://schemas.microsoft.com/office/drawing/2016/ink" xmlns:am3d="http://schemas.microsoft.com/office/drawing/2017/model3d" xmlns:o="urn:schemas-microsoft-com:office:office" xmlns:oel="http://schemas.microsoft.com/office/2019/extlst" xmlns:r="http://schemas.openxmlformats.org/officeDocument/2006/relationships" xmlns:m="http://schemas.openxmlformats.org/officeDocument/2006/math" xmlns:v="urn:schemas-microsoft-com:vml" xmlns:wp14="http://schemas.microsoft.com/office/word/2010/wordprocessingDrawing" xmlns:wp="http://schemas.openxmlformats.org/drawingml/2006/wordprocessingDrawing" xmlns:w10="urn:schemas-microsoft-com:office:word" xmlns:w="http://schemas.openxmlformats.org/wordprocessingml/2006/main" xmlns:w14="http://schemas.microsoft.com/office/word/2010/wordml" xmlns:w15="http://schemas.microsoft.com/office/word/2012/wordml" xmlns:w16cex="http://schemas.microsoft.com/office/word/2018/wordml/cex" xmlns:w16cid="http://schemas.microsoft.com/office/word/2016/wordml/cid" xmlns:w16="http://schemas.microsoft.com/office/word/2018/wordml" xmlns:w16du="http://schemas.microsoft.com/office/word/2023/wordml/word16du" xmlns:w16sdtdh="http://schemas.microsoft.com/office/word/2020/wordml/sdtdatahash" xmlns:w16sdtfl="http://schemas.microsoft.com/office/word/2024/wordml/sdtformatlock" xmlns:w16se="http://schemas.microsoft.com/office/word/2015/wordml/symex" xmlns:wpg="http://schemas.microsoft.com/office/word/2010/wordprocessingGroup" xmlns:wpi="http://schemas.microsoft.com/office/word/2010/wordprocessingInk" xmlns:wne="http://schemas.microsoft.com/office/word/2006/wordml" xmlns:wps="http://schemas.microsoft.com/office/word/2010/wordprocessingShape" mc:Ignorable="w14 w15 w16se w16cid w16 w16cex w16sdtdh w16sdtfl w16du wp14">
   <w:abstractNum w:abstractNumId="0" w15:restartNumberingAfterBreak="0">
     <w:nsid w:val="209F3D4A"/>
     <w:multiLevelType w:val="hybridMultilevel"/>
@@ -4737,7 +5713,7 @@
 </file>
 
 <file path=word/styles.xml><?xml version="1.0" encoding="utf-8"?>
-<w:styles xmlns:mc="http://schemas.openxmlformats.org/markup-compatibility/2006" xmlns:r="http://schemas.openxmlformats.org/officeDocument/2006/relationships" xmlns:w="http://schemas.openxmlformats.org/wordprocessingml/2006/main" xmlns:w14="http://schemas.microsoft.com/office/word/2010/wordml" xmlns:w15="http://schemas.microsoft.com/office/word/2012/wordml" xmlns:w16cex="http://schemas.microsoft.com/office/word/2018/wordml/cex" xmlns:w16cid="http://schemas.microsoft.com/office/word/2016/wordml/cid" xmlns:w16="http://schemas.microsoft.com/office/word/2018/wordml" xmlns:w16sdtdh="http://schemas.microsoft.com/office/word/2020/wordml/sdtdatahash" xmlns:w16se="http://schemas.microsoft.com/office/word/2015/wordml/symex" mc:Ignorable="w14 w15 w16se w16cid w16 w16cex w16sdtdh">
+<w:styles xmlns:mc="http://schemas.openxmlformats.org/markup-compatibility/2006" xmlns:r="http://schemas.openxmlformats.org/officeDocument/2006/relationships" xmlns:w="http://schemas.openxmlformats.org/wordprocessingml/2006/main" xmlns:w14="http://schemas.microsoft.com/office/word/2010/wordml" xmlns:w15="http://schemas.microsoft.com/office/word/2012/wordml" xmlns:w16cex="http://schemas.microsoft.com/office/word/2018/wordml/cex" xmlns:w16cid="http://schemas.microsoft.com/office/word/2016/wordml/cid" xmlns:w16="http://schemas.microsoft.com/office/word/2018/wordml" xmlns:w16du="http://schemas.microsoft.com/office/word/2023/wordml/word16du" xmlns:w16sdtdh="http://schemas.microsoft.com/office/word/2020/wordml/sdtdatahash" xmlns:w16sdtfl="http://schemas.microsoft.com/office/word/2024/wordml/sdtformatlock" xmlns:w16se="http://schemas.microsoft.com/office/word/2015/wordml/symex" mc:Ignorable="w14 w15 w16se w16cid w16 w16cex w16sdtdh w16sdtfl w16du">
   <w:docDefaults>
     <w:rPrDefault>
       <w:rPr>
@@ -5607,6 +6583,27 @@
 </file>
 
 <file path=customXml/item1.xml><?xml version="1.0" encoding="utf-8"?>
+<p:properties xmlns:p="http://schemas.microsoft.com/office/2006/metadata/properties" xmlns:xsi="http://www.w3.org/2001/XMLSchema-instance" xmlns:pc="http://schemas.microsoft.com/office/infopath/2007/PartnerControls">
+  <documentManagement>
+    <TaxCatchAll xmlns="fc2e0b91-73db-4711-986b-9e7114b1c780" xsi:nil="true"/>
+    <lcf76f155ced4ddcb4097134ff3c332f xmlns="aa22b7f0-1c77-4983-9187-bff8e7aaefd5">
+      <Terms xmlns="http://schemas.microsoft.com/office/infopath/2007/PartnerControls"/>
+    </lcf76f155ced4ddcb4097134ff3c332f>
+    <Note xmlns="aa22b7f0-1c77-4983-9187-bff8e7aaefd5" xsi:nil="true"/>
+  </documentManagement>
+</p:properties>
+</file>
+
+<file path=customXml/item2.xml><?xml version="1.0" encoding="utf-8"?>
+<?mso-contentType ?>
+<FormTemplates xmlns="http://schemas.microsoft.com/sharepoint/v3/contenttype/forms">
+  <Display>DocumentLibraryForm</Display>
+  <Edit>DocumentLibraryForm</Edit>
+  <New>DocumentLibraryForm</New>
+</FormTemplates>
+</file>
+
+<file path=customXml/item3.xml><?xml version="1.0" encoding="utf-8"?>
 <ct:contentTypeSchema xmlns:ct="http://schemas.microsoft.com/office/2006/metadata/contentType" xmlns:ma="http://schemas.microsoft.com/office/2006/metadata/properties/metaAttributes" ct:_="" ma:_="" ma:contentTypeName="Document" ma:contentTypeID="0x01010041FCC52ECBA99C44897D8B99E45B6EB2" ma:contentTypeVersion="20" ma:contentTypeDescription="Create a new document." ma:contentTypeScope="" ma:versionID="98dd51a1eb8d717f429cfb72bbcdf291">
   <xsd:schema xmlns:xsd="http://www.w3.org/2001/XMLSchema" xmlns:xs="http://www.w3.org/2001/XMLSchema" xmlns:p="http://schemas.microsoft.com/office/2006/metadata/properties" xmlns:ns2="aa22b7f0-1c77-4983-9187-bff8e7aaefd5" xmlns:ns3="fc2e0b91-73db-4711-986b-9e7114b1c780" targetNamespace="http://schemas.microsoft.com/office/2006/metadata/properties" ma:root="true" ma:fieldsID="764fccced344541160bdf3d7a4f43fd4" ns2:_="" ns3:_="">
     <xsd:import namespace="aa22b7f0-1c77-4983-9187-bff8e7aaefd5"/>
@@ -5863,28 +6860,26 @@
 </ct:contentTypeSchema>
 </file>
 
-<file path=customXml/item2.xml><?xml version="1.0" encoding="utf-8"?>
-<p:properties xmlns:p="http://schemas.microsoft.com/office/2006/metadata/properties" xmlns:xsi="http://www.w3.org/2001/XMLSchema-instance" xmlns:pc="http://schemas.microsoft.com/office/infopath/2007/PartnerControls">
-  <documentManagement>
-    <TaxCatchAll xmlns="fc2e0b91-73db-4711-986b-9e7114b1c780" xsi:nil="true"/>
-    <lcf76f155ced4ddcb4097134ff3c332f xmlns="aa22b7f0-1c77-4983-9187-bff8e7aaefd5">
-      <Terms xmlns="http://schemas.microsoft.com/office/infopath/2007/PartnerControls"/>
-    </lcf76f155ced4ddcb4097134ff3c332f>
-    <Note xmlns="aa22b7f0-1c77-4983-9187-bff8e7aaefd5" xsi:nil="true"/>
-  </documentManagement>
-</p:properties>
+<file path=customXml/itemProps1.xml><?xml version="1.0" encoding="utf-8"?>
+<ds:datastoreItem xmlns:ds="http://schemas.openxmlformats.org/officeDocument/2006/customXml" ds:itemID="{20C66F9F-F7B4-4B87-8910-A2DDB634D5E0}">
+  <ds:schemaRefs>
+    <ds:schemaRef ds:uri="http://schemas.microsoft.com/office/2006/metadata/properties"/>
+    <ds:schemaRef ds:uri="http://schemas.microsoft.com/office/infopath/2007/PartnerControls"/>
+    <ds:schemaRef ds:uri="fc2e0b91-73db-4711-986b-9e7114b1c780"/>
+    <ds:schemaRef ds:uri="aa22b7f0-1c77-4983-9187-bff8e7aaefd5"/>
+  </ds:schemaRefs>
+</ds:datastoreItem>
 </file>
 
-<file path=customXml/item3.xml><?xml version="1.0" encoding="utf-8"?>
-<?mso-contentType ?>
-<FormTemplates xmlns="http://schemas.microsoft.com/sharepoint/v3/contenttype/forms">
-  <Display>DocumentLibraryForm</Display>
-  <Edit>DocumentLibraryForm</Edit>
-  <New>DocumentLibraryForm</New>
-</FormTemplates>
+<file path=customXml/itemProps2.xml><?xml version="1.0" encoding="utf-8"?>
+<ds:datastoreItem xmlns:ds="http://schemas.openxmlformats.org/officeDocument/2006/customXml" ds:itemID="{61801A56-0FD2-4394-93D8-612F28940603}">
+  <ds:schemaRefs>
+    <ds:schemaRef ds:uri="http://schemas.microsoft.com/sharepoint/v3/contenttype/forms"/>
+  </ds:schemaRefs>
+</ds:datastoreItem>
 </file>
 
-<file path=customXml/itemProps1.xml><?xml version="1.0" encoding="utf-8"?>
+<file path=customXml/itemProps3.xml><?xml version="1.0" encoding="utf-8"?>
 <ds:datastoreItem xmlns:ds="http://schemas.openxmlformats.org/officeDocument/2006/customXml" ds:itemID="{82045B43-7134-4D42-9F91-65658FCA0A3C}">
   <ds:schemaRefs>
     <ds:schemaRef ds:uri="http://schemas.microsoft.com/office/2006/metadata/contentType"/>
@@ -5901,23 +6896,4 @@
     <ds:schemaRef ds:uri="http://schemas.microsoft.com/internal/obd"/>
   </ds:schemaRefs>
 </ds:datastoreItem>
-</file>
-
-<file path=customXml/itemProps2.xml><?xml version="1.0" encoding="utf-8"?>
-<ds:datastoreItem xmlns:ds="http://schemas.openxmlformats.org/officeDocument/2006/customXml" ds:itemID="{20C66F9F-F7B4-4B87-8910-A2DDB634D5E0}">
-  <ds:schemaRefs>
-    <ds:schemaRef ds:uri="http://schemas.microsoft.com/office/2006/metadata/properties"/>
-    <ds:schemaRef ds:uri="http://schemas.microsoft.com/office/infopath/2007/PartnerControls"/>
-    <ds:schemaRef ds:uri="fc2e0b91-73db-4711-986b-9e7114b1c780"/>
-    <ds:schemaRef ds:uri="aa22b7f0-1c77-4983-9187-bff8e7aaefd5"/>
-  </ds:schemaRefs>
-</ds:datastoreItem>
-</file>
-
-<file path=customXml/itemProps3.xml><?xml version="1.0" encoding="utf-8"?>
-<ds:datastoreItem xmlns:ds="http://schemas.openxmlformats.org/officeDocument/2006/customXml" ds:itemID="{61801A56-0FD2-4394-93D8-612F28940603}">
-  <ds:schemaRefs>
-    <ds:schemaRef ds:uri="http://schemas.microsoft.com/sharepoint/v3/contenttype/forms"/>
-  </ds:schemaRefs>
-</ds:datastoreItem>
 </file>
</xml_diff>